<commit_message>
Correct moving idea forms and Water as perceived balance
Apply the author's clarification: Wind, Fog, Water and Mist are forms of the moving idea within one person's two-in-one. Water represents perceived balance. Identify the other water as D2O with two deuterium atoms and one oxygen atom without assigning a new psychological role.

Update the testing document, diagram, episode form and community model. Preserve all numerical results, source data, equations and frozen analysis protocol.
</commit_message>
<xml_diff>
--- a/studies/community-two-in-one/Two_in_one_testing_protocol.docx
+++ b/studies/community-two-in-one/Two_in_one_testing_protocol.docx
@@ -80,7 +80,7 @@
     <w:p>
       <w:pPr/>
       <w:r>
-        <w:t>Smoke is the inward speaking position. Clay is the inward listening position. The middle is the idea moving between them. Both positions can change what is retained, questioned, reformulated or refused. These are functions within one person, not two people or permanent personality classes.</w:t>
+        <w:t>Smoke is inward speaking and Clay is inward listening. The middle is the idea moving between them: Wind, Fog, Water, Mist and the other named forms describe that moving idea itself. Water represents perceived balance. The other water is heavy water, D₂O. Both inward positions can affect what is retained, questioned, reformulated or refused.</w:t>
       </w:r>
     </w:p>
     <w:p>
@@ -479,7 +479,7 @@
                 <w:b w:val="0"/>
                 <w:sz w:val="20"/>
               </w:rPr>
-              <w:t>Content changing between positions</w:t>
+              <w:t>The middle taking the named forms below</w:t>
             </w:r>
           </w:p>
         </w:tc>
@@ -508,7 +508,7 @@
                 <w:b w:val="0"/>
                 <w:sz w:val="20"/>
               </w:rPr>
-              <w:t>Before and after accounts; which claim, target, implication or force changed</w:t>
+              <w:t>Before and after accounts; form, claim, target, implication and force</w:t>
             </w:r>
           </w:p>
         </w:tc>
@@ -571,7 +571,7 @@
                 <w:b w:val="0"/>
                 <w:sz w:val="20"/>
               </w:rPr>
-              <w:t>Internalized or unspoken agreement</w:t>
+              <w:t>Moving idea as internalized or unspoken agreement</w:t>
             </w:r>
           </w:p>
         </w:tc>
@@ -663,7 +663,7 @@
                 <w:b w:val="0"/>
                 <w:sz w:val="20"/>
               </w:rPr>
-              <w:t>Remembered past with variable clarity</w:t>
+              <w:t>Moving idea associated with remembered past and variable clarity</w:t>
             </w:r>
           </w:p>
         </w:tc>
@@ -755,7 +755,7 @@
                 <w:b w:val="0"/>
                 <w:sz w:val="20"/>
               </w:rPr>
-              <w:t>Space between memories and experienced time</w:t>
+              <w:t>Moving idea associated with space between memories and experienced time</w:t>
             </w:r>
           </w:p>
         </w:tc>
@@ -818,7 +818,7 @@
                 <w:b w:val="0"/>
                 <w:sz w:val="20"/>
               </w:rPr>
-              <w:t>Perceived balance</w:t>
+              <w:t>Water</w:t>
             </w:r>
           </w:p>
         </w:tc>
@@ -847,7 +847,7 @@
                 <w:b w:val="0"/>
                 <w:sz w:val="20"/>
               </w:rPr>
-              <w:t>Calm or agreement may coexist with disturbance</w:t>
+              <w:t>Moving idea as perceived balance</w:t>
             </w:r>
           </w:p>
         </w:tc>
@@ -876,7 +876,7 @@
                 <w:b w:val="0"/>
                 <w:sz w:val="20"/>
               </w:rPr>
-              <w:t>Calm, agreement and unresolved tension as separate ratings</w:t>
+              <w:t>Perceived balance, calm, agreement and unresolved tension rated separately</w:t>
             </w:r>
           </w:p>
         </w:tc>
@@ -910,7 +910,7 @@
                 <w:b w:val="0"/>
                 <w:sz w:val="20"/>
               </w:rPr>
-              <w:t>Water</w:t>
+              <w:t>Heavy water</w:t>
             </w:r>
           </w:p>
         </w:tc>
@@ -939,7 +939,7 @@
                 <w:b w:val="0"/>
                 <w:sz w:val="20"/>
               </w:rPr>
-              <w:t>Adaptation where this word fits</w:t>
+              <w:t>The other water form called D₂O</w:t>
             </w:r>
           </w:p>
         </w:tc>
@@ -968,7 +968,7 @@
                 <w:b w:val="0"/>
                 <w:sz w:val="20"/>
               </w:rPr>
-              <w:t>What changed, what persisted and what that change cost</w:t>
+              <w:t>Its distinct role in the idea model still needs the author’s definition</w:t>
             </w:r>
           </w:p>
         </w:tc>
@@ -982,7 +982,7 @@
     <w:p>
       <w:pPr/>
       <w:r>
-        <w:t>D₂O is the author’s image for perceived balance. H₂O₂ is a different substance; its specific role in this interpretation remains undefined. Leave peroxide unassigned until the author supplies its intended relationship. No chemical properties become psychological causes by analogy.</w:t>
+        <w:t>Heavy water, D₂O, contains two deuterium (²H) atoms and one oxygen atom. [5] The author assigns perceived balance to Water. This corrects the earlier attribution of balance to D₂O. The difference between the two water forms in the idea model must be described before it can be tested. Peroxide remains separately undefined here.</w:t>
       </w:r>
     </w:p>
     <w:p>
@@ -2583,9 +2583,9 @@
                 <w:b w:val="0"/>
                 <w:sz w:val="20"/>
               </w:rPr>
-              <w:t>What changed or remained? Same claim / rephrased / revised / rejected / uncertain</w:t>
+              <w:t>Same claim / rephrased / revised / rejected / uncertain</w:t>
               <w:br/>
-              <w:t>________________________________________________</w:t>
+              <w:t>Idea form before and after: water / fog / mist / wind / heavy water / other / none / unknown</w:t>
               <w:br/>
               <w:t>________________________________________________</w:t>
             </w:r>
@@ -2715,9 +2715,11 @@
                 <w:b w:val="0"/>
                 <w:sz w:val="20"/>
               </w:rPr>
-              <w:t>Calm __  Agreement __  Unresolved tension __</w:t>
+              <w:t>Perceived balance __  Calm __  Agreement __</w:t>
               <w:br/>
-              <w:t>Vividness __  Certainty __  Freedom to reconsider __</w:t>
+              <w:t>Unresolved tension __  Vividness __  Certainty __</w:t>
+              <w:br/>
+              <w:t>Freedom to reconsider __</w:t>
             </w:r>
           </w:p>
         </w:tc>
@@ -4072,6 +4074,12 @@
     <w:p>
       <w:pPr/>
       <w:r>
+        <w:t>[5] PubChem. Deuterium Oxide, compound 24602. https://pubchem.ncbi.nlm.nih.gov/compound/24602. Chemical identity only; the idea forms and perceived-balance mapping are the author’s definitions.</w:t>
+      </w:r>
+    </w:p>
+    <w:p>
+      <w:pPr/>
+      <w:r>
         <w:t>SciSpace located the CRAM sources and candidate measures of dialogical activity. The EEG dataset Thinking out loud (10.1038/s41597-022-01147-2) was screened out for this question: fixed commands do not track a moving autobiographical idea. IDAS-R (10.1080/10720537.2024.2446756) is a candidate instrument, not longitudinal evidence used here. Search summaries were not treated as completed validation.</w:t>
       </w:r>
     </w:p>

</xml_diff>